<commit_message>
feat: add admin dashboard views, cargo store script, and API tests
</commit_message>
<xml_diff>
--- a/TAI_LIEU_GIAI_PHAP_BID_CARGO_CHO_AGENTS.docx
+++ b/TAI_LIEU_GIAI_PHAP_BID_CARGO_CHO_AGENTS.docx
@@ -201,7 +201,7 @@
           <w:sz w:val="26"/>
           <w:szCs w:val="26"/>
         </w:rPr>
-        <w:t xml:space="preserve">Version v1.0</w:t>
+        <w:t xml:space="preserve">Version v1.2</w:t>
       </w:r>
     </w:p>
     <w:p>
@@ -430,7 +430,7 @@
           <w:sz w:val="28"/>
           <w:szCs w:val="28"/>
         </w:rPr>
-        <w:t xml:space="preserve">2. TỔỔNG QUAN LUỒNG NGHIỆP VỤ &amp; SƠ ĐỒ HOẠT ĐỘNG (SYSTEM FLOWS)</w:t>
+        <w:t xml:space="preserve">2. TỔNG QUAN LUỒNG NGHIỆP VỤ &amp; SƠ ĐỒ HOẠT ĐỘNG (SYSTEM FLOWS)</w:t>
       </w:r>
     </w:p>
     <w:p>
@@ -2372,7 +2372,7 @@
           <w:sz w:val="24"/>
           <w:szCs w:val="24"/>
         </w:rPr>
-        <w:t xml:space="preserve">Bảo mật Chống Path Traversal: Đường dẫn truy cập tập tin `/uploads/` được mã hóa kiểm tra ngặt nghèo, ngăn chặn các cuộc tấn công đọc file hệ thống trái phép.</w:t>
+        <w:t xml:space="preserve">Bảo mật Chống Path Traversal: Đường dẫn truy cập tập tin /uploads/ được kiểm tra ngặt nghèo, ngăn chặn các cuộc tấn công đọc file hệ thống trái phép.</w:t>
       </w:r>
     </w:p>
     <w:p>
@@ -2392,7 +2392,7 @@
           <w:sz w:val="24"/>
           <w:szCs w:val="24"/>
         </w:rPr>
-        <w:t xml:space="preserve">Bảo mật Sealed-Bid Privacy: Dữ liệu giá thầu được mã hóa phân quyền trả về theo token/session của từng đại lý, đảm bảo không rò rỉ dữ liệu cạnh tranh.</w:t>
+        <w:t xml:space="preserve">Bảo mật Sealed-Bid Privacy: Dữ liệu giá thầu được phân quyền trả về theo agentCode của từng đại lý, đảm bảo không rò rỉ dữ liệu cạnh tranh.</w:t>
       </w:r>
     </w:p>
     <w:p>
@@ -2412,7 +2412,7 @@
           <w:sz w:val="24"/>
           <w:szCs w:val="24"/>
         </w:rPr>
-        <w:t xml:space="preserve">SQL Injection &amp; Atomic Transaction: Mọi câu lệnh thao tác SQLite/SQL Server đều sử dụng Parameterized Query và Transaction cô lập (Isolation level).</w:t>
+        <w:t xml:space="preserve">SQL Injection &amp; Atomic Transaction: Mọi câu lệnh thao tác SQLite đều sử dụng Parameterized Query và Transaction cô lập.</w:t>
       </w:r>
     </w:p>
     <w:p>
@@ -2429,7 +2429,7 @@
           <w:sz w:val="28"/>
           <w:szCs w:val="28"/>
         </w:rPr>
-        <w:t xml:space="preserve">6. KẾT LUẬN &amp; HƯỚNG DẪN VẬN HÀNH</w:t>
+        <w:t xml:space="preserve">6. KIỂM THỬ TỰ ĐỘNG (AUTOMATION TEST SUITE — JEST &amp; SUPERTEST)</w:t>
       </w:r>
     </w:p>
     <w:p>
@@ -2446,7 +2446,2295 @@
           <w:sz w:val="24"/>
           <w:szCs w:val="24"/>
         </w:rPr>
-        <w:t xml:space="preserve">Giải pháp Sàn Đấu Giá Tải Trọng Hàng Không Vietravel Airlines (VU Air Cargo Bidding) v1.0 đã đáp ứng hoàn hảo các yêu cầu về nghiệp vụ vận tải hàng không hiện đại, mang lại quy trình minh bạch, tốc độ và tối ưu doanh thu khai thác tối đa cho Hãng.</w:t>
+        <w:t xml:space="preserve">Trạng thái v1.1: 12/12 Test Cases PASS — bộ test tự khởi động HTTP Server nội bộ (cổng 8086), không phụ thuộc server đang chạy ngoài.</w:t>
+      </w:r>
+    </w:p>
+    <w:tbl>
+      <w:tblPr>
+        <w:tblW w:type="pct" w:w="100%"/>
+        <w:tblBorders>
+          <w:top w:val="single" w:color="003366" w:sz="4"/>
+          <w:left w:val="single" w:color="D3D3D3" w:sz="2"/>
+          <w:bottom w:val="single" w:color="003366" w:sz="4"/>
+          <w:right w:val="single" w:color="D3D3D3" w:sz="2"/>
+          <w:insideH w:val="single" w:color="E0E0E0" w:sz="2"/>
+          <w:insideV w:val="single" w:color="E0E0E0" w:sz="2"/>
+        </w:tblBorders>
+      </w:tblPr>
+      <w:tblGrid>
+        <w:gridCol w:w="100"/>
+        <w:gridCol w:w="100"/>
+        <w:gridCol w:w="100"/>
+        <w:gridCol w:w="100"/>
+      </w:tblGrid>
+      <w:tr>
+        <w:trPr>
+          <w:tblHeader/>
+        </w:trPr>
+        <w:tc>
+          <w:tcPr>
+            <w:shd w:fill="003366" w:val="clear"/>
+            <w:tcMar>
+              <w:top w:type="dxa" w:w="100"/>
+              <w:left w:type="dxa" w:w="150"/>
+              <w:bottom w:type="dxa" w:w="100"/>
+              <w:right w:type="dxa" w:w="150"/>
+            </w:tcMar>
+          </w:tcPr>
+          <w:p>
+            <w:pPr>
+              <w:jc w:val="center"/>
+            </w:pPr>
+            <w:r>
+              <w:rPr>
+                <w:rFonts w:ascii="Times New Roman" w:cs="Times New Roman" w:eastAsia="Times New Roman" w:hAnsi="Times New Roman"/>
+                <w:b/>
+                <w:bCs/>
+                <w:color w:val="FFFFFF"/>
+                <w:sz w:val="22"/>
+                <w:szCs w:val="22"/>
+              </w:rPr>
+              <w:t xml:space="preserve">Mã TC</w:t>
+            </w:r>
+          </w:p>
+        </w:tc>
+        <w:tc>
+          <w:tcPr>
+            <w:shd w:fill="003366" w:val="clear"/>
+            <w:tcMar>
+              <w:top w:type="dxa" w:w="100"/>
+              <w:left w:type="dxa" w:w="150"/>
+              <w:bottom w:type="dxa" w:w="100"/>
+              <w:right w:type="dxa" w:w="150"/>
+            </w:tcMar>
+          </w:tcPr>
+          <w:p>
+            <w:pPr>
+              <w:jc w:val="center"/>
+            </w:pPr>
+            <w:r>
+              <w:rPr>
+                <w:rFonts w:ascii="Times New Roman" w:cs="Times New Roman" w:eastAsia="Times New Roman" w:hAnsi="Times New Roman"/>
+                <w:b/>
+                <w:bCs/>
+                <w:color w:val="FFFFFF"/>
+                <w:sz w:val="22"/>
+                <w:szCs w:val="22"/>
+              </w:rPr>
+              <w:t xml:space="preserve">Kịch bản</w:t>
+            </w:r>
+          </w:p>
+        </w:tc>
+        <w:tc>
+          <w:tcPr>
+            <w:shd w:fill="003366" w:val="clear"/>
+            <w:tcMar>
+              <w:top w:type="dxa" w:w="100"/>
+              <w:left w:type="dxa" w:w="150"/>
+              <w:bottom w:type="dxa" w:w="100"/>
+              <w:right w:type="dxa" w:w="150"/>
+            </w:tcMar>
+          </w:tcPr>
+          <w:p>
+            <w:pPr>
+              <w:jc w:val="center"/>
+            </w:pPr>
+            <w:r>
+              <w:rPr>
+                <w:rFonts w:ascii="Times New Roman" w:cs="Times New Roman" w:eastAsia="Times New Roman" w:hAnsi="Times New Roman"/>
+                <w:b/>
+                <w:bCs/>
+                <w:color w:val="FFFFFF"/>
+                <w:sz w:val="22"/>
+                <w:szCs w:val="22"/>
+              </w:rPr>
+              <w:t xml:space="preserve">API Endpoint</w:t>
+            </w:r>
+          </w:p>
+        </w:tc>
+        <w:tc>
+          <w:tcPr>
+            <w:shd w:fill="003366" w:val="clear"/>
+            <w:tcMar>
+              <w:top w:type="dxa" w:w="100"/>
+              <w:left w:type="dxa" w:w="150"/>
+              <w:bottom w:type="dxa" w:w="100"/>
+              <w:right w:type="dxa" w:w="150"/>
+            </w:tcMar>
+          </w:tcPr>
+          <w:p>
+            <w:pPr>
+              <w:jc w:val="center"/>
+            </w:pPr>
+            <w:r>
+              <w:rPr>
+                <w:rFonts w:ascii="Times New Roman" w:cs="Times New Roman" w:eastAsia="Times New Roman" w:hAnsi="Times New Roman"/>
+                <w:b/>
+                <w:bCs/>
+                <w:color w:val="FFFFFF"/>
+                <w:sz w:val="22"/>
+                <w:szCs w:val="22"/>
+              </w:rPr>
+              <w:t xml:space="preserve">Kết quả</w:t>
+            </w:r>
+          </w:p>
+        </w:tc>
+      </w:tr>
+      <w:tr>
+        <w:tc>
+          <w:tcPr>
+            <w:shd w:fill="F2F5F8" w:val="clear"/>
+            <w:tcMar>
+              <w:top w:type="dxa" w:w="80"/>
+              <w:left w:type="dxa" w:w="120"/>
+              <w:bottom w:type="dxa" w:w="80"/>
+              <w:right w:type="dxa" w:w="120"/>
+            </w:tcMar>
+          </w:tcPr>
+          <w:p>
+            <w:r>
+              <w:rPr>
+                <w:rFonts w:ascii="Times New Roman" w:cs="Times New Roman" w:eastAsia="Times New Roman" w:hAnsi="Times New Roman"/>
+                <w:sz w:val="22"/>
+                <w:szCs w:val="22"/>
+              </w:rPr>
+              <w:t xml:space="preserve">HP-01</w:t>
+            </w:r>
+          </w:p>
+        </w:tc>
+        <w:tc>
+          <w:tcPr>
+            <w:shd w:fill="F2F5F8" w:val="clear"/>
+            <w:tcMar>
+              <w:top w:type="dxa" w:w="80"/>
+              <w:left w:type="dxa" w:w="120"/>
+              <w:bottom w:type="dxa" w:w="80"/>
+              <w:right w:type="dxa" w:w="120"/>
+            </w:tcMar>
+          </w:tcPr>
+          <w:p>
+            <w:r>
+              <w:rPr>
+                <w:rFonts w:ascii="Times New Roman" w:cs="Times New Roman" w:eastAsia="Times New Roman" w:hAnsi="Times New Roman"/>
+                <w:sz w:val="22"/>
+                <w:szCs w:val="22"/>
+              </w:rPr>
+              <w:t xml:space="preserve">Lấy cấu trúc dữ liệu sàn thầu</w:t>
+            </w:r>
+          </w:p>
+        </w:tc>
+        <w:tc>
+          <w:tcPr>
+            <w:shd w:fill="F2F5F8" w:val="clear"/>
+            <w:tcMar>
+              <w:top w:type="dxa" w:w="80"/>
+              <w:left w:type="dxa" w:w="120"/>
+              <w:bottom w:type="dxa" w:w="80"/>
+              <w:right w:type="dxa" w:w="120"/>
+            </w:tcMar>
+          </w:tcPr>
+          <w:p>
+            <w:r>
+              <w:rPr>
+                <w:rFonts w:ascii="Times New Roman" w:cs="Times New Roman" w:eastAsia="Times New Roman" w:hAnsi="Times New Roman"/>
+                <w:sz w:val="22"/>
+                <w:szCs w:val="22"/>
+              </w:rPr>
+              <w:t xml:space="preserve">GET /api/data</w:t>
+            </w:r>
+          </w:p>
+        </w:tc>
+        <w:tc>
+          <w:tcPr>
+            <w:shd w:fill="F2F5F8" w:val="clear"/>
+            <w:tcMar>
+              <w:top w:type="dxa" w:w="80"/>
+              <w:left w:type="dxa" w:w="120"/>
+              <w:bottom w:type="dxa" w:w="80"/>
+              <w:right w:type="dxa" w:w="120"/>
+            </w:tcMar>
+          </w:tcPr>
+          <w:p>
+            <w:r>
+              <w:rPr>
+                <w:rFonts w:ascii="Times New Roman" w:cs="Times New Roman" w:eastAsia="Times New Roman" w:hAnsi="Times New Roman"/>
+                <w:sz w:val="22"/>
+                <w:szCs w:val="22"/>
+              </w:rPr>
+              <w:t xml:space="preserve">200 OK — auctions &amp; wonAuctions hợp lệ</w:t>
+            </w:r>
+          </w:p>
+        </w:tc>
+      </w:tr>
+      <w:tr>
+        <w:tc>
+          <w:tcPr>
+            <w:shd w:fill="FFFFFF" w:val="clear"/>
+            <w:tcMar>
+              <w:top w:type="dxa" w:w="80"/>
+              <w:left w:type="dxa" w:w="120"/>
+              <w:bottom w:type="dxa" w:w="80"/>
+              <w:right w:type="dxa" w:w="120"/>
+            </w:tcMar>
+          </w:tcPr>
+          <w:p>
+            <w:r>
+              <w:rPr>
+                <w:rFonts w:ascii="Times New Roman" w:cs="Times New Roman" w:eastAsia="Times New Roman" w:hAnsi="Times New Roman"/>
+                <w:sz w:val="22"/>
+                <w:szCs w:val="22"/>
+              </w:rPr>
+              <w:t xml:space="preserve">HP-02</w:t>
+            </w:r>
+          </w:p>
+        </w:tc>
+        <w:tc>
+          <w:tcPr>
+            <w:shd w:fill="FFFFFF" w:val="clear"/>
+            <w:tcMar>
+              <w:top w:type="dxa" w:w="80"/>
+              <w:left w:type="dxa" w:w="120"/>
+              <w:bottom w:type="dxa" w:w="80"/>
+              <w:right w:type="dxa" w:w="120"/>
+            </w:tcMar>
+          </w:tcPr>
+          <w:p>
+            <w:r>
+              <w:rPr>
+                <w:rFonts w:ascii="Times New Roman" w:cs="Times New Roman" w:eastAsia="Times New Roman" w:hAnsi="Times New Roman"/>
+                <w:sz w:val="22"/>
+                <w:szCs w:val="22"/>
+              </w:rPr>
+              <w:t xml:space="preserve">Tạo mã QR Thanh toán MoMo</w:t>
+            </w:r>
+          </w:p>
+        </w:tc>
+        <w:tc>
+          <w:tcPr>
+            <w:shd w:fill="FFFFFF" w:val="clear"/>
+            <w:tcMar>
+              <w:top w:type="dxa" w:w="80"/>
+              <w:left w:type="dxa" w:w="120"/>
+              <w:bottom w:type="dxa" w:w="80"/>
+              <w:right w:type="dxa" w:w="120"/>
+            </w:tcMar>
+          </w:tcPr>
+          <w:p>
+            <w:r>
+              <w:rPr>
+                <w:rFonts w:ascii="Times New Roman" w:cs="Times New Roman" w:eastAsia="Times New Roman" w:hAnsi="Times New Roman"/>
+                <w:sz w:val="22"/>
+                <w:szCs w:val="22"/>
+              </w:rPr>
+              <w:t xml:space="preserve">POST /api/momo/create</w:t>
+            </w:r>
+          </w:p>
+        </w:tc>
+        <w:tc>
+          <w:tcPr>
+            <w:shd w:fill="FFFFFF" w:val="clear"/>
+            <w:tcMar>
+              <w:top w:type="dxa" w:w="80"/>
+              <w:left w:type="dxa" w:w="120"/>
+              <w:bottom w:type="dxa" w:w="80"/>
+              <w:right w:type="dxa" w:w="120"/>
+            </w:tcMar>
+          </w:tcPr>
+          <w:p>
+            <w:r>
+              <w:rPr>
+                <w:rFonts w:ascii="Times New Roman" w:cs="Times New Roman" w:eastAsia="Times New Roman" w:hAnsi="Times New Roman"/>
+                <w:sz w:val="22"/>
+                <w:szCs w:val="22"/>
+              </w:rPr>
+              <w:t xml:space="preserve">200 OK — orderInfo chuẩn, amount capped 50M VND</w:t>
+            </w:r>
+          </w:p>
+        </w:tc>
+      </w:tr>
+      <w:tr>
+        <w:tc>
+          <w:tcPr>
+            <w:shd w:fill="F2F5F8" w:val="clear"/>
+            <w:tcMar>
+              <w:top w:type="dxa" w:w="80"/>
+              <w:left w:type="dxa" w:w="120"/>
+              <w:bottom w:type="dxa" w:w="80"/>
+              <w:right w:type="dxa" w:w="120"/>
+            </w:tcMar>
+          </w:tcPr>
+          <w:p>
+            <w:r>
+              <w:rPr>
+                <w:rFonts w:ascii="Times New Roman" w:cs="Times New Roman" w:eastAsia="Times New Roman" w:hAnsi="Times New Roman"/>
+                <w:sz w:val="22"/>
+                <w:szCs w:val="22"/>
+              </w:rPr>
+              <w:t xml:space="preserve">HP-03</w:t>
+            </w:r>
+          </w:p>
+        </w:tc>
+        <w:tc>
+          <w:tcPr>
+            <w:shd w:fill="F2F5F8" w:val="clear"/>
+            <w:tcMar>
+              <w:top w:type="dxa" w:w="80"/>
+              <w:left w:type="dxa" w:w="120"/>
+              <w:bottom w:type="dxa" w:w="80"/>
+              <w:right w:type="dxa" w:w="120"/>
+            </w:tcMar>
+          </w:tcPr>
+          <w:p>
+            <w:r>
+              <w:rPr>
+                <w:rFonts w:ascii="Times New Roman" w:cs="Times New Roman" w:eastAsia="Times New Roman" w:hAnsi="Times New Roman"/>
+                <w:sz w:val="22"/>
+                <w:szCs w:val="22"/>
+              </w:rPr>
+              <w:t xml:space="preserve">Webhook MoMo IPN HMAC-SHA256</w:t>
+            </w:r>
+          </w:p>
+        </w:tc>
+        <w:tc>
+          <w:tcPr>
+            <w:shd w:fill="F2F5F8" w:val="clear"/>
+            <w:tcMar>
+              <w:top w:type="dxa" w:w="80"/>
+              <w:left w:type="dxa" w:w="120"/>
+              <w:bottom w:type="dxa" w:w="80"/>
+              <w:right w:type="dxa" w:w="120"/>
+            </w:tcMar>
+          </w:tcPr>
+          <w:p>
+            <w:r>
+              <w:rPr>
+                <w:rFonts w:ascii="Times New Roman" w:cs="Times New Roman" w:eastAsia="Times New Roman" w:hAnsi="Times New Roman"/>
+                <w:sz w:val="22"/>
+                <w:szCs w:val="22"/>
+              </w:rPr>
+              <w:t xml:space="preserve">POST /api/momo/ipn</w:t>
+            </w:r>
+          </w:p>
+        </w:tc>
+        <w:tc>
+          <w:tcPr>
+            <w:shd w:fill="F2F5F8" w:val="clear"/>
+            <w:tcMar>
+              <w:top w:type="dxa" w:w="80"/>
+              <w:left w:type="dxa" w:w="120"/>
+              <w:bottom w:type="dxa" w:w="80"/>
+              <w:right w:type="dxa" w:w="120"/>
+            </w:tcMar>
+          </w:tcPr>
+          <w:p>
+            <w:r>
+              <w:rPr>
+                <w:rFonts w:ascii="Times New Roman" w:cs="Times New Roman" w:eastAsia="Times New Roman" w:hAnsi="Times New Roman"/>
+                <w:sz w:val="22"/>
+                <w:szCs w:val="22"/>
+              </w:rPr>
+              <w:t xml:space="preserve">204 No Content — paymentStatus cập nhật PAID</w:t>
+            </w:r>
+          </w:p>
+        </w:tc>
+      </w:tr>
+      <w:tr>
+        <w:tc>
+          <w:tcPr>
+            <w:shd w:fill="FFFFFF" w:val="clear"/>
+            <w:tcMar>
+              <w:top w:type="dxa" w:w="80"/>
+              <w:left w:type="dxa" w:w="120"/>
+              <w:bottom w:type="dxa" w:w="80"/>
+              <w:right w:type="dxa" w:w="120"/>
+            </w:tcMar>
+          </w:tcPr>
+          <w:p>
+            <w:r>
+              <w:rPr>
+                <w:rFonts w:ascii="Times New Roman" w:cs="Times New Roman" w:eastAsia="Times New Roman" w:hAnsi="Times New Roman"/>
+                <w:sz w:val="22"/>
+                <w:szCs w:val="22"/>
+              </w:rPr>
+              <w:t xml:space="preserve">HP-04</w:t>
+            </w:r>
+          </w:p>
+        </w:tc>
+        <w:tc>
+          <w:tcPr>
+            <w:shd w:fill="FFFFFF" w:val="clear"/>
+            <w:tcMar>
+              <w:top w:type="dxa" w:w="80"/>
+              <w:left w:type="dxa" w:w="120"/>
+              <w:bottom w:type="dxa" w:w="80"/>
+              <w:right w:type="dxa" w:w="120"/>
+            </w:tcMar>
+          </w:tcPr>
+          <w:p>
+            <w:r>
+              <w:rPr>
+                <w:rFonts w:ascii="Times New Roman" w:cs="Times New Roman" w:eastAsia="Times New Roman" w:hAnsi="Times New Roman"/>
+                <w:sz w:val="22"/>
+                <w:szCs w:val="22"/>
+              </w:rPr>
+              <w:t xml:space="preserve">Luồng hỗ trợ Chat Realtime</w:t>
+            </w:r>
+          </w:p>
+        </w:tc>
+        <w:tc>
+          <w:tcPr>
+            <w:shd w:fill="FFFFFF" w:val="clear"/>
+            <w:tcMar>
+              <w:top w:type="dxa" w:w="80"/>
+              <w:left w:type="dxa" w:w="120"/>
+              <w:bottom w:type="dxa" w:w="80"/>
+              <w:right w:type="dxa" w:w="120"/>
+            </w:tcMar>
+          </w:tcPr>
+          <w:p>
+            <w:r>
+              <w:rPr>
+                <w:rFonts w:ascii="Times New Roman" w:cs="Times New Roman" w:eastAsia="Times New Roman" w:hAnsi="Times New Roman"/>
+                <w:sz w:val="22"/>
+                <w:szCs w:val="22"/>
+              </w:rPr>
+              <w:t xml:space="preserve">POST /api/chat/create + send</w:t>
+            </w:r>
+          </w:p>
+        </w:tc>
+        <w:tc>
+          <w:tcPr>
+            <w:shd w:fill="FFFFFF" w:val="clear"/>
+            <w:tcMar>
+              <w:top w:type="dxa" w:w="80"/>
+              <w:left w:type="dxa" w:w="120"/>
+              <w:bottom w:type="dxa" w:w="80"/>
+              <w:right w:type="dxa" w:w="120"/>
+            </w:tcMar>
+          </w:tcPr>
+          <w:p>
+            <w:r>
+              <w:rPr>
+                <w:rFonts w:ascii="Times New Roman" w:cs="Times New Roman" w:eastAsia="Times New Roman" w:hAnsi="Times New Roman"/>
+                <w:sz w:val="22"/>
+                <w:szCs w:val="22"/>
+              </w:rPr>
+              <w:t xml:space="preserve">200 OK — phiên chat tạo &amp; nhắn tin thành công</w:t>
+            </w:r>
+          </w:p>
+        </w:tc>
+      </w:tr>
+      <w:tr>
+        <w:tc>
+          <w:tcPr>
+            <w:shd w:fill="F2F5F8" w:val="clear"/>
+            <w:tcMar>
+              <w:top w:type="dxa" w:w="80"/>
+              <w:left w:type="dxa" w:w="120"/>
+              <w:bottom w:type="dxa" w:w="80"/>
+              <w:right w:type="dxa" w:w="120"/>
+            </w:tcMar>
+          </w:tcPr>
+          <w:p>
+            <w:r>
+              <w:rPr>
+                <w:rFonts w:ascii="Times New Roman" w:cs="Times New Roman" w:eastAsia="Times New Roman" w:hAnsi="Times New Roman"/>
+                <w:sz w:val="22"/>
+                <w:szCs w:val="22"/>
+              </w:rPr>
+              <w:t xml:space="preserve">HP-05</w:t>
+            </w:r>
+          </w:p>
+        </w:tc>
+        <w:tc>
+          <w:tcPr>
+            <w:shd w:fill="F2F5F8" w:val="clear"/>
+            <w:tcMar>
+              <w:top w:type="dxa" w:w="80"/>
+              <w:left w:type="dxa" w:w="120"/>
+              <w:bottom w:type="dxa" w:w="80"/>
+              <w:right w:type="dxa" w:w="120"/>
+            </w:tcMar>
+          </w:tcPr>
+          <w:p>
+            <w:r>
+              <w:rPr>
+                <w:rFonts w:ascii="Times New Roman" w:cs="Times New Roman" w:eastAsia="Times New Roman" w:hAnsi="Times New Roman"/>
+                <w:sz w:val="22"/>
+                <w:szCs w:val="22"/>
+              </w:rPr>
+              <w:t xml:space="preserve">Sealed-Bid Privacy Guard</w:t>
+            </w:r>
+          </w:p>
+        </w:tc>
+        <w:tc>
+          <w:tcPr>
+            <w:shd w:fill="F2F5F8" w:val="clear"/>
+            <w:tcMar>
+              <w:top w:type="dxa" w:w="80"/>
+              <w:left w:type="dxa" w:w="120"/>
+              <w:bottom w:type="dxa" w:w="80"/>
+              <w:right w:type="dxa" w:w="120"/>
+            </w:tcMar>
+          </w:tcPr>
+          <w:p>
+            <w:r>
+              <w:rPr>
+                <w:rFonts w:ascii="Times New Roman" w:cs="Times New Roman" w:eastAsia="Times New Roman" w:hAnsi="Times New Roman"/>
+                <w:sz w:val="22"/>
+                <w:szCs w:val="22"/>
+              </w:rPr>
+              <w:t xml:space="preserve">GET /api/data?agentCode=AG-0892</w:t>
+            </w:r>
+          </w:p>
+        </w:tc>
+        <w:tc>
+          <w:tcPr>
+            <w:shd w:fill="F2F5F8" w:val="clear"/>
+            <w:tcMar>
+              <w:top w:type="dxa" w:w="80"/>
+              <w:left w:type="dxa" w:w="120"/>
+              <w:bottom w:type="dxa" w:w="80"/>
+              <w:right w:type="dxa" w:w="120"/>
+            </w:tcMar>
+          </w:tcPr>
+          <w:p>
+            <w:r>
+              <w:rPr>
+                <w:rFonts w:ascii="Times New Roman" w:cs="Times New Roman" w:eastAsia="Times New Roman" w:hAnsi="Times New Roman"/>
+                <w:sz w:val="22"/>
+                <w:szCs w:val="22"/>
+              </w:rPr>
+              <w:t xml:space="preserve">200 OK — bids đối thủ bị ẩn danh AG-***</w:t>
+            </w:r>
+          </w:p>
+        </w:tc>
+      </w:tr>
+      <w:tr>
+        <w:tc>
+          <w:tcPr>
+            <w:shd w:fill="FFFFFF" w:val="clear"/>
+            <w:tcMar>
+              <w:top w:type="dxa" w:w="80"/>
+              <w:left w:type="dxa" w:w="120"/>
+              <w:bottom w:type="dxa" w:w="80"/>
+              <w:right w:type="dxa" w:w="120"/>
+            </w:tcMar>
+          </w:tcPr>
+          <w:p>
+            <w:r>
+              <w:rPr>
+                <w:rFonts w:ascii="Times New Roman" w:cs="Times New Roman" w:eastAsia="Times New Roman" w:hAnsi="Times New Roman"/>
+                <w:sz w:val="22"/>
+                <w:szCs w:val="22"/>
+              </w:rPr>
+              <w:t xml:space="preserve">HP-06</w:t>
+            </w:r>
+          </w:p>
+        </w:tc>
+        <w:tc>
+          <w:tcPr>
+            <w:shd w:fill="FFFFFF" w:val="clear"/>
+            <w:tcMar>
+              <w:top w:type="dxa" w:w="80"/>
+              <w:left w:type="dxa" w:w="120"/>
+              <w:bottom w:type="dxa" w:w="80"/>
+              <w:right w:type="dxa" w:w="120"/>
+            </w:tcMar>
+          </w:tcPr>
+          <w:p>
+            <w:r>
+              <w:rPr>
+                <w:rFonts w:ascii="Times New Roman" w:cs="Times New Roman" w:eastAsia="Times New Roman" w:hAnsi="Times New Roman"/>
+                <w:sz w:val="22"/>
+                <w:szCs w:val="22"/>
+              </w:rPr>
+              <w:t xml:space="preserve">Đặt thầu Atomic SQLite</w:t>
+            </w:r>
+          </w:p>
+        </w:tc>
+        <w:tc>
+          <w:tcPr>
+            <w:shd w:fill="FFFFFF" w:val="clear"/>
+            <w:tcMar>
+              <w:top w:type="dxa" w:w="80"/>
+              <w:left w:type="dxa" w:w="120"/>
+              <w:bottom w:type="dxa" w:w="80"/>
+              <w:right w:type="dxa" w:w="120"/>
+            </w:tcMar>
+          </w:tcPr>
+          <w:p>
+            <w:r>
+              <w:rPr>
+                <w:rFonts w:ascii="Times New Roman" w:cs="Times New Roman" w:eastAsia="Times New Roman" w:hAnsi="Times New Roman"/>
+                <w:sz w:val="22"/>
+                <w:szCs w:val="22"/>
+              </w:rPr>
+              <w:t xml:space="preserve">POST /api/bids/place</w:t>
+            </w:r>
+          </w:p>
+        </w:tc>
+        <w:tc>
+          <w:tcPr>
+            <w:shd w:fill="FFFFFF" w:val="clear"/>
+            <w:tcMar>
+              <w:top w:type="dxa" w:w="80"/>
+              <w:left w:type="dxa" w:w="120"/>
+              <w:bottom w:type="dxa" w:w="80"/>
+              <w:right w:type="dxa" w:w="120"/>
+            </w:tcMar>
+          </w:tcPr>
+          <w:p>
+            <w:r>
+              <w:rPr>
+                <w:rFonts w:ascii="Times New Roman" w:cs="Times New Roman" w:eastAsia="Times New Roman" w:hAnsi="Times New Roman"/>
+                <w:sz w:val="22"/>
+                <w:szCs w:val="22"/>
+              </w:rPr>
+              <w:t xml:space="preserve">200 OK — bid ghi nguyên tử vào DB</w:t>
+            </w:r>
+          </w:p>
+        </w:tc>
+      </w:tr>
+      <w:tr>
+        <w:tc>
+          <w:tcPr>
+            <w:shd w:fill="F2F5F8" w:val="clear"/>
+            <w:tcMar>
+              <w:top w:type="dxa" w:w="80"/>
+              <w:left w:type="dxa" w:w="120"/>
+              <w:bottom w:type="dxa" w:w="80"/>
+              <w:right w:type="dxa" w:w="120"/>
+            </w:tcMar>
+          </w:tcPr>
+          <w:p>
+            <w:r>
+              <w:rPr>
+                <w:rFonts w:ascii="Times New Roman" w:cs="Times New Roman" w:eastAsia="Times New Roman" w:hAnsi="Times New Roman"/>
+                <w:sz w:val="22"/>
+                <w:szCs w:val="22"/>
+              </w:rPr>
+              <w:t xml:space="preserve">NP-01</w:t>
+            </w:r>
+          </w:p>
+        </w:tc>
+        <w:tc>
+          <w:tcPr>
+            <w:shd w:fill="F2F5F8" w:val="clear"/>
+            <w:tcMar>
+              <w:top w:type="dxa" w:w="80"/>
+              <w:left w:type="dxa" w:w="120"/>
+              <w:bottom w:type="dxa" w:w="80"/>
+              <w:right w:type="dxa" w:w="120"/>
+            </w:tcMar>
+          </w:tcPr>
+          <w:p>
+            <w:r>
+              <w:rPr>
+                <w:rFonts w:ascii="Times New Roman" w:cs="Times New Roman" w:eastAsia="Times New Roman" w:hAnsi="Times New Roman"/>
+                <w:sz w:val="22"/>
+                <w:szCs w:val="22"/>
+              </w:rPr>
+              <w:t xml:space="preserve">Thiếu wonId</w:t>
+            </w:r>
+          </w:p>
+        </w:tc>
+        <w:tc>
+          <w:tcPr>
+            <w:shd w:fill="F2F5F8" w:val="clear"/>
+            <w:tcMar>
+              <w:top w:type="dxa" w:w="80"/>
+              <w:left w:type="dxa" w:w="120"/>
+              <w:bottom w:type="dxa" w:w="80"/>
+              <w:right w:type="dxa" w:w="120"/>
+            </w:tcMar>
+          </w:tcPr>
+          <w:p>
+            <w:r>
+              <w:rPr>
+                <w:rFonts w:ascii="Times New Roman" w:cs="Times New Roman" w:eastAsia="Times New Roman" w:hAnsi="Times New Roman"/>
+                <w:sz w:val="22"/>
+                <w:szCs w:val="22"/>
+              </w:rPr>
+              <w:t xml:space="preserve">POST /api/momo/create</w:t>
+            </w:r>
+          </w:p>
+        </w:tc>
+        <w:tc>
+          <w:tcPr>
+            <w:shd w:fill="F2F5F8" w:val="clear"/>
+            <w:tcMar>
+              <w:top w:type="dxa" w:w="80"/>
+              <w:left w:type="dxa" w:w="120"/>
+              <w:bottom w:type="dxa" w:w="80"/>
+              <w:right w:type="dxa" w:w="120"/>
+            </w:tcMar>
+          </w:tcPr>
+          <w:p>
+            <w:r>
+              <w:rPr>
+                <w:rFonts w:ascii="Times New Roman" w:cs="Times New Roman" w:eastAsia="Times New Roman" w:hAnsi="Times New Roman"/>
+                <w:sz w:val="22"/>
+                <w:szCs w:val="22"/>
+              </w:rPr>
+              <w:t xml:space="preserve">400 — wonId is required</w:t>
+            </w:r>
+          </w:p>
+        </w:tc>
+      </w:tr>
+      <w:tr>
+        <w:tc>
+          <w:tcPr>
+            <w:shd w:fill="FFFFFF" w:val="clear"/>
+            <w:tcMar>
+              <w:top w:type="dxa" w:w="80"/>
+              <w:left w:type="dxa" w:w="120"/>
+              <w:bottom w:type="dxa" w:w="80"/>
+              <w:right w:type="dxa" w:w="120"/>
+            </w:tcMar>
+          </w:tcPr>
+          <w:p>
+            <w:r>
+              <w:rPr>
+                <w:rFonts w:ascii="Times New Roman" w:cs="Times New Roman" w:eastAsia="Times New Roman" w:hAnsi="Times New Roman"/>
+                <w:sz w:val="22"/>
+                <w:szCs w:val="22"/>
+              </w:rPr>
+              <w:t xml:space="preserve">NP-02</w:t>
+            </w:r>
+          </w:p>
+        </w:tc>
+        <w:tc>
+          <w:tcPr>
+            <w:shd w:fill="FFFFFF" w:val="clear"/>
+            <w:tcMar>
+              <w:top w:type="dxa" w:w="80"/>
+              <w:left w:type="dxa" w:w="120"/>
+              <w:bottom w:type="dxa" w:w="80"/>
+              <w:right w:type="dxa" w:w="120"/>
+            </w:tcMar>
+          </w:tcPr>
+          <w:p>
+            <w:r>
+              <w:rPr>
+                <w:rFonts w:ascii="Times New Roman" w:cs="Times New Roman" w:eastAsia="Times New Roman" w:hAnsi="Times New Roman"/>
+                <w:sz w:val="22"/>
+                <w:szCs w:val="22"/>
+              </w:rPr>
+              <w:t xml:space="preserve">wonId không tồn tại</w:t>
+            </w:r>
+          </w:p>
+        </w:tc>
+        <w:tc>
+          <w:tcPr>
+            <w:shd w:fill="FFFFFF" w:val="clear"/>
+            <w:tcMar>
+              <w:top w:type="dxa" w:w="80"/>
+              <w:left w:type="dxa" w:w="120"/>
+              <w:bottom w:type="dxa" w:w="80"/>
+              <w:right w:type="dxa" w:w="120"/>
+            </w:tcMar>
+          </w:tcPr>
+          <w:p>
+            <w:r>
+              <w:rPr>
+                <w:rFonts w:ascii="Times New Roman" w:cs="Times New Roman" w:eastAsia="Times New Roman" w:hAnsi="Times New Roman"/>
+                <w:sz w:val="22"/>
+                <w:szCs w:val="22"/>
+              </w:rPr>
+              <w:t xml:space="preserve">POST /api/momo/create</w:t>
+            </w:r>
+          </w:p>
+        </w:tc>
+        <w:tc>
+          <w:tcPr>
+            <w:shd w:fill="FFFFFF" w:val="clear"/>
+            <w:tcMar>
+              <w:top w:type="dxa" w:w="80"/>
+              <w:left w:type="dxa" w:w="120"/>
+              <w:bottom w:type="dxa" w:w="80"/>
+              <w:right w:type="dxa" w:w="120"/>
+            </w:tcMar>
+          </w:tcPr>
+          <w:p>
+            <w:r>
+              <w:rPr>
+                <w:rFonts w:ascii="Times New Roman" w:cs="Times New Roman" w:eastAsia="Times New Roman" w:hAnsi="Times New Roman"/>
+                <w:sz w:val="22"/>
+                <w:szCs w:val="22"/>
+              </w:rPr>
+              <w:t xml:space="preserve">404 — Won auction not found</w:t>
+            </w:r>
+          </w:p>
+        </w:tc>
+      </w:tr>
+      <w:tr>
+        <w:tc>
+          <w:tcPr>
+            <w:shd w:fill="F2F5F8" w:val="clear"/>
+            <w:tcMar>
+              <w:top w:type="dxa" w:w="80"/>
+              <w:left w:type="dxa" w:w="120"/>
+              <w:bottom w:type="dxa" w:w="80"/>
+              <w:right w:type="dxa" w:w="120"/>
+            </w:tcMar>
+          </w:tcPr>
+          <w:p>
+            <w:r>
+              <w:rPr>
+                <w:rFonts w:ascii="Times New Roman" w:cs="Times New Roman" w:eastAsia="Times New Roman" w:hAnsi="Times New Roman"/>
+                <w:sz w:val="22"/>
+                <w:szCs w:val="22"/>
+              </w:rPr>
+              <w:t xml:space="preserve">NP-03</w:t>
+            </w:r>
+          </w:p>
+        </w:tc>
+        <w:tc>
+          <w:tcPr>
+            <w:shd w:fill="F2F5F8" w:val="clear"/>
+            <w:tcMar>
+              <w:top w:type="dxa" w:w="80"/>
+              <w:left w:type="dxa" w:w="120"/>
+              <w:bottom w:type="dxa" w:w="80"/>
+              <w:right w:type="dxa" w:w="120"/>
+            </w:tcMar>
+          </w:tcPr>
+          <w:p>
+            <w:r>
+              <w:rPr>
+                <w:rFonts w:ascii="Times New Roman" w:cs="Times New Roman" w:eastAsia="Times New Roman" w:hAnsi="Times New Roman"/>
+                <w:sz w:val="22"/>
+                <w:szCs w:val="22"/>
+              </w:rPr>
+              <w:t xml:space="preserve">Đơn đã PAID thanh toán lại</w:t>
+            </w:r>
+          </w:p>
+        </w:tc>
+        <w:tc>
+          <w:tcPr>
+            <w:shd w:fill="F2F5F8" w:val="clear"/>
+            <w:tcMar>
+              <w:top w:type="dxa" w:w="80"/>
+              <w:left w:type="dxa" w:w="120"/>
+              <w:bottom w:type="dxa" w:w="80"/>
+              <w:right w:type="dxa" w:w="120"/>
+            </w:tcMar>
+          </w:tcPr>
+          <w:p>
+            <w:r>
+              <w:rPr>
+                <w:rFonts w:ascii="Times New Roman" w:cs="Times New Roman" w:eastAsia="Times New Roman" w:hAnsi="Times New Roman"/>
+                <w:sz w:val="22"/>
+                <w:szCs w:val="22"/>
+              </w:rPr>
+              <w:t xml:space="preserve">POST /api/momo/create</w:t>
+            </w:r>
+          </w:p>
+        </w:tc>
+        <w:tc>
+          <w:tcPr>
+            <w:shd w:fill="F2F5F8" w:val="clear"/>
+            <w:tcMar>
+              <w:top w:type="dxa" w:w="80"/>
+              <w:left w:type="dxa" w:w="120"/>
+              <w:bottom w:type="dxa" w:w="80"/>
+              <w:right w:type="dxa" w:w="120"/>
+            </w:tcMar>
+          </w:tcPr>
+          <w:p>
+            <w:r>
+              <w:rPr>
+                <w:rFonts w:ascii="Times New Roman" w:cs="Times New Roman" w:eastAsia="Times New Roman" w:hAnsi="Times New Roman"/>
+                <w:sz w:val="22"/>
+                <w:szCs w:val="22"/>
+              </w:rPr>
+              <w:t xml:space="preserve">400 — Order already paid</w:t>
+            </w:r>
+          </w:p>
+        </w:tc>
+      </w:tr>
+      <w:tr>
+        <w:tc>
+          <w:tcPr>
+            <w:shd w:fill="FFFFFF" w:val="clear"/>
+            <w:tcMar>
+              <w:top w:type="dxa" w:w="80"/>
+              <w:left w:type="dxa" w:w="120"/>
+              <w:bottom w:type="dxa" w:w="80"/>
+              <w:right w:type="dxa" w:w="120"/>
+            </w:tcMar>
+          </w:tcPr>
+          <w:p>
+            <w:r>
+              <w:rPr>
+                <w:rFonts w:ascii="Times New Roman" w:cs="Times New Roman" w:eastAsia="Times New Roman" w:hAnsi="Times New Roman"/>
+                <w:sz w:val="22"/>
+                <w:szCs w:val="22"/>
+              </w:rPr>
+              <w:t xml:space="preserve">NP-04</w:t>
+            </w:r>
+          </w:p>
+        </w:tc>
+        <w:tc>
+          <w:tcPr>
+            <w:shd w:fill="FFFFFF" w:val="clear"/>
+            <w:tcMar>
+              <w:top w:type="dxa" w:w="80"/>
+              <w:left w:type="dxa" w:w="120"/>
+              <w:bottom w:type="dxa" w:w="80"/>
+              <w:right w:type="dxa" w:w="120"/>
+            </w:tcMar>
+          </w:tcPr>
+          <w:p>
+            <w:r>
+              <w:rPr>
+                <w:rFonts w:ascii="Times New Roman" w:cs="Times New Roman" w:eastAsia="Times New Roman" w:hAnsi="Times New Roman"/>
+                <w:sz w:val="22"/>
+                <w:szCs w:val="22"/>
+              </w:rPr>
+              <w:t xml:space="preserve">Chữ ký HMAC giả mạo</w:t>
+            </w:r>
+          </w:p>
+        </w:tc>
+        <w:tc>
+          <w:tcPr>
+            <w:shd w:fill="FFFFFF" w:val="clear"/>
+            <w:tcMar>
+              <w:top w:type="dxa" w:w="80"/>
+              <w:left w:type="dxa" w:w="120"/>
+              <w:bottom w:type="dxa" w:w="80"/>
+              <w:right w:type="dxa" w:w="120"/>
+            </w:tcMar>
+          </w:tcPr>
+          <w:p>
+            <w:r>
+              <w:rPr>
+                <w:rFonts w:ascii="Times New Roman" w:cs="Times New Roman" w:eastAsia="Times New Roman" w:hAnsi="Times New Roman"/>
+                <w:sz w:val="22"/>
+                <w:szCs w:val="22"/>
+              </w:rPr>
+              <w:t xml:space="preserve">POST /api/momo/ipn</w:t>
+            </w:r>
+          </w:p>
+        </w:tc>
+        <w:tc>
+          <w:tcPr>
+            <w:shd w:fill="FFFFFF" w:val="clear"/>
+            <w:tcMar>
+              <w:top w:type="dxa" w:w="80"/>
+              <w:left w:type="dxa" w:w="120"/>
+              <w:bottom w:type="dxa" w:w="80"/>
+              <w:right w:type="dxa" w:w="120"/>
+            </w:tcMar>
+          </w:tcPr>
+          <w:p>
+            <w:r>
+              <w:rPr>
+                <w:rFonts w:ascii="Times New Roman" w:cs="Times New Roman" w:eastAsia="Times New Roman" w:hAnsi="Times New Roman"/>
+                <w:sz w:val="22"/>
+                <w:szCs w:val="22"/>
+              </w:rPr>
+              <w:t xml:space="preserve">400 — Invalid signature</w:t>
+            </w:r>
+          </w:p>
+        </w:tc>
+      </w:tr>
+      <w:tr>
+        <w:tc>
+          <w:tcPr>
+            <w:shd w:fill="F2F5F8" w:val="clear"/>
+            <w:tcMar>
+              <w:top w:type="dxa" w:w="80"/>
+              <w:left w:type="dxa" w:w="120"/>
+              <w:bottom w:type="dxa" w:w="80"/>
+              <w:right w:type="dxa" w:w="120"/>
+            </w:tcMar>
+          </w:tcPr>
+          <w:p>
+            <w:r>
+              <w:rPr>
+                <w:rFonts w:ascii="Times New Roman" w:cs="Times New Roman" w:eastAsia="Times New Roman" w:hAnsi="Times New Roman"/>
+                <w:sz w:val="22"/>
+                <w:szCs w:val="22"/>
+              </w:rPr>
+              <w:t xml:space="preserve">NP-05</w:t>
+            </w:r>
+          </w:p>
+        </w:tc>
+        <w:tc>
+          <w:tcPr>
+            <w:shd w:fill="F2F5F8" w:val="clear"/>
+            <w:tcMar>
+              <w:top w:type="dxa" w:w="80"/>
+              <w:left w:type="dxa" w:w="120"/>
+              <w:bottom w:type="dxa" w:w="80"/>
+              <w:right w:type="dxa" w:w="120"/>
+            </w:tcMar>
+          </w:tcPr>
+          <w:p>
+            <w:r>
+              <w:rPr>
+                <w:rFonts w:ascii="Times New Roman" w:cs="Times New Roman" w:eastAsia="Times New Roman" w:hAnsi="Times New Roman"/>
+                <w:sz w:val="22"/>
+                <w:szCs w:val="22"/>
+              </w:rPr>
+              <w:t xml:space="preserve">Path Traversal ../../.env</w:t>
+            </w:r>
+          </w:p>
+        </w:tc>
+        <w:tc>
+          <w:tcPr>
+            <w:shd w:fill="F2F5F8" w:val="clear"/>
+            <w:tcMar>
+              <w:top w:type="dxa" w:w="80"/>
+              <w:left w:type="dxa" w:w="120"/>
+              <w:bottom w:type="dxa" w:w="80"/>
+              <w:right w:type="dxa" w:w="120"/>
+            </w:tcMar>
+          </w:tcPr>
+          <w:p>
+            <w:r>
+              <w:rPr>
+                <w:rFonts w:ascii="Times New Roman" w:cs="Times New Roman" w:eastAsia="Times New Roman" w:hAnsi="Times New Roman"/>
+                <w:sz w:val="22"/>
+                <w:szCs w:val="22"/>
+              </w:rPr>
+              <w:t xml:space="preserve">GET /uploads/../../.env</w:t>
+            </w:r>
+          </w:p>
+        </w:tc>
+        <w:tc>
+          <w:tcPr>
+            <w:shd w:fill="F2F5F8" w:val="clear"/>
+            <w:tcMar>
+              <w:top w:type="dxa" w:w="80"/>
+              <w:left w:type="dxa" w:w="120"/>
+              <w:bottom w:type="dxa" w:w="80"/>
+              <w:right w:type="dxa" w:w="120"/>
+            </w:tcMar>
+          </w:tcPr>
+          <w:p>
+            <w:r>
+              <w:rPr>
+                <w:rFonts w:ascii="Times New Roman" w:cs="Times New Roman" w:eastAsia="Times New Roman" w:hAnsi="Times New Roman"/>
+                <w:sz w:val="22"/>
+                <w:szCs w:val="22"/>
+              </w:rPr>
+              <w:t xml:space="preserve">403 Forbidden — Security Guard chặn</w:t>
+            </w:r>
+          </w:p>
+        </w:tc>
+      </w:tr>
+      <w:tr>
+        <w:tc>
+          <w:tcPr>
+            <w:shd w:fill="FFFFFF" w:val="clear"/>
+            <w:tcMar>
+              <w:top w:type="dxa" w:w="80"/>
+              <w:left w:type="dxa" w:w="120"/>
+              <w:bottom w:type="dxa" w:w="80"/>
+              <w:right w:type="dxa" w:w="120"/>
+            </w:tcMar>
+          </w:tcPr>
+          <w:p>
+            <w:r>
+              <w:rPr>
+                <w:rFonts w:ascii="Times New Roman" w:cs="Times New Roman" w:eastAsia="Times New Roman" w:hAnsi="Times New Roman"/>
+                <w:sz w:val="22"/>
+                <w:szCs w:val="22"/>
+              </w:rPr>
+              <w:t xml:space="preserve">NP-06</w:t>
+            </w:r>
+          </w:p>
+        </w:tc>
+        <w:tc>
+          <w:tcPr>
+            <w:shd w:fill="FFFFFF" w:val="clear"/>
+            <w:tcMar>
+              <w:top w:type="dxa" w:w="80"/>
+              <w:left w:type="dxa" w:w="120"/>
+              <w:bottom w:type="dxa" w:w="80"/>
+              <w:right w:type="dxa" w:w="120"/>
+            </w:tcMar>
+          </w:tcPr>
+          <w:p>
+            <w:r>
+              <w:rPr>
+                <w:rFonts w:ascii="Times New Roman" w:cs="Times New Roman" w:eastAsia="Times New Roman" w:hAnsi="Times New Roman"/>
+                <w:sz w:val="22"/>
+                <w:szCs w:val="22"/>
+              </w:rPr>
+              <w:t xml:space="preserve">Thiếu wonId query param</w:t>
+            </w:r>
+          </w:p>
+        </w:tc>
+        <w:tc>
+          <w:tcPr>
+            <w:shd w:fill="FFFFFF" w:val="clear"/>
+            <w:tcMar>
+              <w:top w:type="dxa" w:w="80"/>
+              <w:left w:type="dxa" w:w="120"/>
+              <w:bottom w:type="dxa" w:w="80"/>
+              <w:right w:type="dxa" w:w="120"/>
+            </w:tcMar>
+          </w:tcPr>
+          <w:p>
+            <w:r>
+              <w:rPr>
+                <w:rFonts w:ascii="Times New Roman" w:cs="Times New Roman" w:eastAsia="Times New Roman" w:hAnsi="Times New Roman"/>
+                <w:sz w:val="22"/>
+                <w:szCs w:val="22"/>
+              </w:rPr>
+              <w:t xml:space="preserve">GET /api/momo/status</w:t>
+            </w:r>
+          </w:p>
+        </w:tc>
+        <w:tc>
+          <w:tcPr>
+            <w:shd w:fill="FFFFFF" w:val="clear"/>
+            <w:tcMar>
+              <w:top w:type="dxa" w:w="80"/>
+              <w:left w:type="dxa" w:w="120"/>
+              <w:bottom w:type="dxa" w:w="80"/>
+              <w:right w:type="dxa" w:w="120"/>
+            </w:tcMar>
+          </w:tcPr>
+          <w:p>
+            <w:r>
+              <w:rPr>
+                <w:rFonts w:ascii="Times New Roman" w:cs="Times New Roman" w:eastAsia="Times New Roman" w:hAnsi="Times New Roman"/>
+                <w:sz w:val="22"/>
+                <w:szCs w:val="22"/>
+              </w:rPr>
+              <w:t xml:space="preserve">400 Bad Request</w:t>
+            </w:r>
+          </w:p>
+        </w:tc>
+      </w:tr>
+    </w:tbl>
+    <w:p>
+      <w:pPr>
+        <w:pStyle w:val="Heading1"/>
+        <w:spacing w:after="120" w:before="280"/>
+      </w:pPr>
+      <w:r>
+        <w:rPr>
+          <w:rFonts w:ascii="Times New Roman" w:cs="Times New Roman" w:eastAsia="Times New Roman" w:hAnsi="Times New Roman"/>
+          <w:b/>
+          <w:bCs/>
+          <w:color w:val="003366"/>
+          <w:sz w:val="28"/>
+          <w:szCs w:val="28"/>
+        </w:rPr>
+        <w:t xml:space="preserve">7. CÁC LỖI ĐÃ SỬA (BUG FIXES — v1.1)</w:t>
+      </w:r>
+    </w:p>
+    <w:tbl>
+      <w:tblPr>
+        <w:tblW w:type="pct" w:w="100%"/>
+        <w:tblBorders>
+          <w:top w:val="single" w:color="003366" w:sz="4"/>
+          <w:left w:val="single" w:color="D3D3D3" w:sz="2"/>
+          <w:bottom w:val="single" w:color="003366" w:sz="4"/>
+          <w:right w:val="single" w:color="D3D3D3" w:sz="2"/>
+          <w:insideH w:val="single" w:color="E0E0E0" w:sz="2"/>
+          <w:insideV w:val="single" w:color="E0E0E0" w:sz="2"/>
+        </w:tblBorders>
+      </w:tblPr>
+      <w:tblGrid>
+        <w:gridCol w:w="100"/>
+        <w:gridCol w:w="100"/>
+        <w:gridCol w:w="100"/>
+      </w:tblGrid>
+      <w:tr>
+        <w:trPr>
+          <w:tblHeader/>
+        </w:trPr>
+        <w:tc>
+          <w:tcPr>
+            <w:shd w:fill="003366" w:val="clear"/>
+            <w:tcMar>
+              <w:top w:type="dxa" w:w="100"/>
+              <w:left w:type="dxa" w:w="150"/>
+              <w:bottom w:type="dxa" w:w="100"/>
+              <w:right w:type="dxa" w:w="150"/>
+            </w:tcMar>
+          </w:tcPr>
+          <w:p>
+            <w:pPr>
+              <w:jc w:val="center"/>
+            </w:pPr>
+            <w:r>
+              <w:rPr>
+                <w:rFonts w:ascii="Times New Roman" w:cs="Times New Roman" w:eastAsia="Times New Roman" w:hAnsi="Times New Roman"/>
+                <w:b/>
+                <w:bCs/>
+                <w:color w:val="FFFFFF"/>
+                <w:sz w:val="22"/>
+                <w:szCs w:val="22"/>
+              </w:rPr>
+              <w:t xml:space="preserve">File</w:t>
+            </w:r>
+          </w:p>
+        </w:tc>
+        <w:tc>
+          <w:tcPr>
+            <w:shd w:fill="003366" w:val="clear"/>
+            <w:tcMar>
+              <w:top w:type="dxa" w:w="100"/>
+              <w:left w:type="dxa" w:w="150"/>
+              <w:bottom w:type="dxa" w:w="100"/>
+              <w:right w:type="dxa" w:w="150"/>
+            </w:tcMar>
+          </w:tcPr>
+          <w:p>
+            <w:pPr>
+              <w:jc w:val="center"/>
+            </w:pPr>
+            <w:r>
+              <w:rPr>
+                <w:rFonts w:ascii="Times New Roman" w:cs="Times New Roman" w:eastAsia="Times New Roman" w:hAnsi="Times New Roman"/>
+                <w:b/>
+                <w:bCs/>
+                <w:color w:val="FFFFFF"/>
+                <w:sz w:val="22"/>
+                <w:szCs w:val="22"/>
+              </w:rPr>
+              <w:t xml:space="preserve">Vấn đề</w:t>
+            </w:r>
+          </w:p>
+        </w:tc>
+        <w:tc>
+          <w:tcPr>
+            <w:shd w:fill="003366" w:val="clear"/>
+            <w:tcMar>
+              <w:top w:type="dxa" w:w="100"/>
+              <w:left w:type="dxa" w:w="150"/>
+              <w:bottom w:type="dxa" w:w="100"/>
+              <w:right w:type="dxa" w:w="150"/>
+            </w:tcMar>
+          </w:tcPr>
+          <w:p>
+            <w:pPr>
+              <w:jc w:val="center"/>
+            </w:pPr>
+            <w:r>
+              <w:rPr>
+                <w:rFonts w:ascii="Times New Roman" w:cs="Times New Roman" w:eastAsia="Times New Roman" w:hAnsi="Times New Roman"/>
+                <w:b/>
+                <w:bCs/>
+                <w:color w:val="FFFFFF"/>
+                <w:sz w:val="22"/>
+                <w:szCs w:val="22"/>
+              </w:rPr>
+              <w:t xml:space="preserve">Trạng thái</w:t>
+            </w:r>
+          </w:p>
+        </w:tc>
+      </w:tr>
+      <w:tr>
+        <w:tc>
+          <w:tcPr>
+            <w:shd w:fill="F2F5F8" w:val="clear"/>
+            <w:tcMar>
+              <w:top w:type="dxa" w:w="80"/>
+              <w:left w:type="dxa" w:w="120"/>
+              <w:bottom w:type="dxa" w:w="80"/>
+              <w:right w:type="dxa" w:w="120"/>
+            </w:tcMar>
+          </w:tcPr>
+          <w:p>
+            <w:r>
+              <w:rPr>
+                <w:rFonts w:ascii="Times New Roman" w:cs="Times New Roman" w:eastAsia="Times New Roman" w:hAnsi="Times New Roman"/>
+                <w:sz w:val="22"/>
+                <w:szCs w:val="22"/>
+              </w:rPr>
+              <w:t xml:space="preserve">server.js</w:t>
+            </w:r>
+          </w:p>
+        </w:tc>
+        <w:tc>
+          <w:tcPr>
+            <w:shd w:fill="F2F5F8" w:val="clear"/>
+            <w:tcMar>
+              <w:top w:type="dxa" w:w="80"/>
+              <w:left w:type="dxa" w:w="120"/>
+              <w:bottom w:type="dxa" w:w="80"/>
+              <w:right w:type="dxa" w:w="120"/>
+            </w:tcMar>
+          </w:tcPr>
+          <w:p>
+            <w:r>
+              <w:rPr>
+                <w:rFonts w:ascii="Times New Roman" w:cs="Times New Roman" w:eastAsia="Times New Roman" w:hAnsi="Times New Roman"/>
+                <w:sz w:val="22"/>
+                <w:szCs w:val="22"/>
+              </w:rPr>
+              <w:t xml:space="preserve">Biến 'changed' chưa khai báo trong POST /api/data — gây ReferenceError tiềm ẩn</w:t>
+            </w:r>
+          </w:p>
+        </w:tc>
+        <w:tc>
+          <w:tcPr>
+            <w:shd w:fill="F2F5F8" w:val="clear"/>
+            <w:tcMar>
+              <w:top w:type="dxa" w:w="80"/>
+              <w:left w:type="dxa" w:w="120"/>
+              <w:bottom w:type="dxa" w:w="80"/>
+              <w:right w:type="dxa" w:w="120"/>
+            </w:tcMar>
+          </w:tcPr>
+          <w:p>
+            <w:r>
+              <w:rPr>
+                <w:rFonts w:ascii="Times New Roman" w:cs="Times New Roman" w:eastAsia="Times New Roman" w:hAnsi="Times New Roman"/>
+                <w:sz w:val="22"/>
+                <w:szCs w:val="22"/>
+              </w:rPr>
+              <w:t xml:space="preserve">Đã sửa</w:t>
+            </w:r>
+          </w:p>
+        </w:tc>
+      </w:tr>
+      <w:tr>
+        <w:tc>
+          <w:tcPr>
+            <w:shd w:fill="FFFFFF" w:val="clear"/>
+            <w:tcMar>
+              <w:top w:type="dxa" w:w="80"/>
+              <w:left w:type="dxa" w:w="120"/>
+              <w:bottom w:type="dxa" w:w="80"/>
+              <w:right w:type="dxa" w:w="120"/>
+            </w:tcMar>
+          </w:tcPr>
+          <w:p>
+            <w:r>
+              <w:rPr>
+                <w:rFonts w:ascii="Times New Roman" w:cs="Times New Roman" w:eastAsia="Times New Roman" w:hAnsi="Times New Roman"/>
+                <w:sz w:val="22"/>
+                <w:szCs w:val="22"/>
+              </w:rPr>
+              <w:t xml:space="preserve">server.js</w:t>
+            </w:r>
+          </w:p>
+        </w:tc>
+        <w:tc>
+          <w:tcPr>
+            <w:shd w:fill="FFFFFF" w:val="clear"/>
+            <w:tcMar>
+              <w:top w:type="dxa" w:w="80"/>
+              <w:left w:type="dxa" w:w="120"/>
+              <w:bottom w:type="dxa" w:w="80"/>
+              <w:right w:type="dxa" w:w="120"/>
+            </w:tcMar>
+          </w:tcPr>
+          <w:p>
+            <w:r>
+              <w:rPr>
+                <w:rFonts w:ascii="Times New Roman" w:cs="Times New Roman" w:eastAsia="Times New Roman" w:hAnsi="Times New Roman"/>
+                <w:sz w:val="22"/>
+                <w:szCs w:val="22"/>
+              </w:rPr>
+              <w:t xml:space="preserve">Thiếu module.exports — server không thể dừng sau test, gây ECONNREFUSED trong Jest</w:t>
+            </w:r>
+          </w:p>
+        </w:tc>
+        <w:tc>
+          <w:tcPr>
+            <w:shd w:fill="FFFFFF" w:val="clear"/>
+            <w:tcMar>
+              <w:top w:type="dxa" w:w="80"/>
+              <w:left w:type="dxa" w:w="120"/>
+              <w:bottom w:type="dxa" w:w="80"/>
+              <w:right w:type="dxa" w:w="120"/>
+            </w:tcMar>
+          </w:tcPr>
+          <w:p>
+            <w:r>
+              <w:rPr>
+                <w:rFonts w:ascii="Times New Roman" w:cs="Times New Roman" w:eastAsia="Times New Roman" w:hAnsi="Times New Roman"/>
+                <w:sz w:val="22"/>
+                <w:szCs w:val="22"/>
+              </w:rPr>
+              <w:t xml:space="preserve">Đã sửa</w:t>
+            </w:r>
+          </w:p>
+        </w:tc>
+      </w:tr>
+      <w:tr>
+        <w:tc>
+          <w:tcPr>
+            <w:shd w:fill="F2F5F8" w:val="clear"/>
+            <w:tcMar>
+              <w:top w:type="dxa" w:w="80"/>
+              <w:left w:type="dxa" w:w="120"/>
+              <w:bottom w:type="dxa" w:w="80"/>
+              <w:right w:type="dxa" w:w="120"/>
+            </w:tcMar>
+          </w:tcPr>
+          <w:p>
+            <w:r>
+              <w:rPr>
+                <w:rFonts w:ascii="Times New Roman" w:cs="Times New Roman" w:eastAsia="Times New Roman" w:hAnsi="Times New Roman"/>
+                <w:sz w:val="22"/>
+                <w:szCs w:val="22"/>
+              </w:rPr>
+              <w:t xml:space="preserve">server.js</w:t>
+            </w:r>
+          </w:p>
+        </w:tc>
+        <w:tc>
+          <w:tcPr>
+            <w:shd w:fill="F2F5F8" w:val="clear"/>
+            <w:tcMar>
+              <w:top w:type="dxa" w:w="80"/>
+              <w:left w:type="dxa" w:w="120"/>
+              <w:bottom w:type="dxa" w:w="80"/>
+              <w:right w:type="dxa" w:w="120"/>
+            </w:tcMar>
+          </w:tcPr>
+          <w:p>
+            <w:r>
+              <w:rPr>
+                <w:rFonts w:ascii="Times New Roman" w:cs="Times New Roman" w:eastAsia="Times New Roman" w:hAnsi="Times New Roman"/>
+                <w:sz w:val="22"/>
+                <w:szCs w:val="22"/>
+              </w:rPr>
+              <w:t xml:space="preserve">saveServerData() gọi SQLite sau khi DB đóng trong test teardown</w:t>
+            </w:r>
+          </w:p>
+        </w:tc>
+        <w:tc>
+          <w:tcPr>
+            <w:shd w:fill="F2F5F8" w:val="clear"/>
+            <w:tcMar>
+              <w:top w:type="dxa" w:w="80"/>
+              <w:left w:type="dxa" w:w="120"/>
+              <w:bottom w:type="dxa" w:w="80"/>
+              <w:right w:type="dxa" w:w="120"/>
+            </w:tcMar>
+          </w:tcPr>
+          <w:p>
+            <w:r>
+              <w:rPr>
+                <w:rFonts w:ascii="Times New Roman" w:cs="Times New Roman" w:eastAsia="Times New Roman" w:hAnsi="Times New Roman"/>
+                <w:sz w:val="22"/>
+                <w:szCs w:val="22"/>
+              </w:rPr>
+              <w:t xml:space="preserve">Đã sửa</w:t>
+            </w:r>
+          </w:p>
+        </w:tc>
+      </w:tr>
+      <w:tr>
+        <w:tc>
+          <w:tcPr>
+            <w:shd w:fill="FFFFFF" w:val="clear"/>
+            <w:tcMar>
+              <w:top w:type="dxa" w:w="80"/>
+              <w:left w:type="dxa" w:w="120"/>
+              <w:bottom w:type="dxa" w:w="80"/>
+              <w:right w:type="dxa" w:w="120"/>
+            </w:tcMar>
+          </w:tcPr>
+          <w:p>
+            <w:r>
+              <w:rPr>
+                <w:rFonts w:ascii="Times New Roman" w:cs="Times New Roman" w:eastAsia="Times New Roman" w:hAnsi="Times New Roman"/>
+                <w:sz w:val="22"/>
+                <w:szCs w:val="22"/>
+              </w:rPr>
+              <w:t xml:space="preserve">db.js</w:t>
+            </w:r>
+          </w:p>
+        </w:tc>
+        <w:tc>
+          <w:tcPr>
+            <w:shd w:fill="FFFFFF" w:val="clear"/>
+            <w:tcMar>
+              <w:top w:type="dxa" w:w="80"/>
+              <w:left w:type="dxa" w:w="120"/>
+              <w:bottom w:type="dxa" w:w="80"/>
+              <w:right w:type="dxa" w:w="120"/>
+            </w:tcMar>
+          </w:tcPr>
+          <w:p>
+            <w:r>
+              <w:rPr>
+                <w:rFonts w:ascii="Times New Roman" w:cs="Times New Roman" w:eastAsia="Times New Roman" w:hAnsi="Times New Roman"/>
+                <w:sz w:val="22"/>
+                <w:szCs w:val="22"/>
+              </w:rPr>
+              <w:t xml:space="preserve">Thiếu hàm close() để đóng kết nối SQLite khi Jest kết thúc</w:t>
+            </w:r>
+          </w:p>
+        </w:tc>
+        <w:tc>
+          <w:tcPr>
+            <w:shd w:fill="FFFFFF" w:val="clear"/>
+            <w:tcMar>
+              <w:top w:type="dxa" w:w="80"/>
+              <w:left w:type="dxa" w:w="120"/>
+              <w:bottom w:type="dxa" w:w="80"/>
+              <w:right w:type="dxa" w:w="120"/>
+            </w:tcMar>
+          </w:tcPr>
+          <w:p>
+            <w:r>
+              <w:rPr>
+                <w:rFonts w:ascii="Times New Roman" w:cs="Times New Roman" w:eastAsia="Times New Roman" w:hAnsi="Times New Roman"/>
+                <w:sz w:val="22"/>
+                <w:szCs w:val="22"/>
+              </w:rPr>
+              <w:t xml:space="preserve">Đã sửa</w:t>
+            </w:r>
+          </w:p>
+        </w:tc>
+      </w:tr>
+      <w:tr>
+        <w:tc>
+          <w:tcPr>
+            <w:shd w:fill="F2F5F8" w:val="clear"/>
+            <w:tcMar>
+              <w:top w:type="dxa" w:w="80"/>
+              <w:left w:type="dxa" w:w="120"/>
+              <w:bottom w:type="dxa" w:w="80"/>
+              <w:right w:type="dxa" w:w="120"/>
+            </w:tcMar>
+          </w:tcPr>
+          <w:p>
+            <w:r>
+              <w:rPr>
+                <w:rFonts w:ascii="Times New Roman" w:cs="Times New Roman" w:eastAsia="Times New Roman" w:hAnsi="Times New Roman"/>
+                <w:sz w:val="22"/>
+                <w:szCs w:val="22"/>
+              </w:rPr>
+              <w:t xml:space="preserve">tests/api.test.js</w:t>
+            </w:r>
+          </w:p>
+        </w:tc>
+        <w:tc>
+          <w:tcPr>
+            <w:shd w:fill="F2F5F8" w:val="clear"/>
+            <w:tcMar>
+              <w:top w:type="dxa" w:w="80"/>
+              <w:left w:type="dxa" w:w="120"/>
+              <w:bottom w:type="dxa" w:w="80"/>
+              <w:right w:type="dxa" w:w="120"/>
+            </w:tcMar>
+          </w:tcPr>
+          <w:p>
+            <w:r>
+              <w:rPr>
+                <w:rFonts w:ascii="Times New Roman" w:cs="Times New Roman" w:eastAsia="Times New Roman" w:hAnsi="Times New Roman"/>
+                <w:sz w:val="22"/>
+                <w:szCs w:val="22"/>
+              </w:rPr>
+              <w:t xml:space="preserve">Dùng URL string localhost:8085 — ECONNREFUSED khi server chưa chạy</w:t>
+            </w:r>
+          </w:p>
+        </w:tc>
+        <w:tc>
+          <w:tcPr>
+            <w:shd w:fill="F2F5F8" w:val="clear"/>
+            <w:tcMar>
+              <w:top w:type="dxa" w:w="80"/>
+              <w:left w:type="dxa" w:w="120"/>
+              <w:bottom w:type="dxa" w:w="80"/>
+              <w:right w:type="dxa" w:w="120"/>
+            </w:tcMar>
+          </w:tcPr>
+          <w:p>
+            <w:r>
+              <w:rPr>
+                <w:rFonts w:ascii="Times New Roman" w:cs="Times New Roman" w:eastAsia="Times New Roman" w:hAnsi="Times New Roman"/>
+                <w:sz w:val="22"/>
+                <w:szCs w:val="22"/>
+              </w:rPr>
+              <w:t xml:space="preserve">Đã sửa</w:t>
+            </w:r>
+          </w:p>
+        </w:tc>
+      </w:tr>
+    </w:tbl>
+    <w:p>
+      <w:pPr>
+        <w:pStyle w:val="Heading1"/>
+        <w:spacing w:after="120" w:before="280"/>
+      </w:pPr>
+      <w:r>
+        <w:rPr>
+          <w:rFonts w:ascii="Times New Roman" w:cs="Times New Roman" w:eastAsia="Times New Roman" w:hAnsi="Times New Roman"/>
+          <w:b/>
+          <w:bCs/>
+          <w:color w:val="003366"/>
+          <w:sz w:val="28"/>
+          <w:szCs w:val="28"/>
+        </w:rPr>
+        <w:t xml:space="preserve">9. KIỂM TRĂ HTML ↔ DB SCHEMA &amp; NÂNG CẤP GIAO DIỆN (v1.2)</w:t>
+      </w:r>
+    </w:p>
+    <w:p>
+      <w:pPr>
+        <w:spacing w:after="60" w:before="60" w:line="276"/>
+        <w:jc w:val="left"/>
+      </w:pPr>
+      <w:r>
+        <w:rPr>
+          <w:rFonts w:ascii="Times New Roman" w:cs="Times New Roman" w:eastAsia="Times New Roman" w:hAnsi="Times New Roman"/>
+          <w:b w:val="false"/>
+          <w:bCs w:val="false"/>
+          <w:color w:val="000000"/>
+          <w:sz w:val="24"/>
+          <w:szCs w:val="24"/>
+        </w:rPr>
+        <w:t xml:space="preserve">Kết quả kiểm tra toàn bộ 20 trang HTML đối chiếu với SQLite schema: 0 API endpoint sai, 6 issues phát hiện và đã xử lý hoàn toàn.</w:t>
+      </w:r>
+    </w:p>
+    <w:tbl>
+      <w:tblPr>
+        <w:tblW w:type="pct" w:w="100%"/>
+        <w:tblBorders>
+          <w:top w:val="single" w:color="003366" w:sz="4"/>
+          <w:left w:val="single" w:color="D3D3D3" w:sz="2"/>
+          <w:bottom w:val="single" w:color="003366" w:sz="4"/>
+          <w:right w:val="single" w:color="D3D3D3" w:sz="2"/>
+          <w:insideH w:val="single" w:color="E0E0E0" w:sz="2"/>
+          <w:insideV w:val="single" w:color="E0E0E0" w:sz="2"/>
+        </w:tblBorders>
+      </w:tblPr>
+      <w:tblGrid>
+        <w:gridCol w:w="100"/>
+        <w:gridCol w:w="100"/>
+        <w:gridCol w:w="100"/>
+      </w:tblGrid>
+      <w:tr>
+        <w:trPr>
+          <w:tblHeader/>
+        </w:trPr>
+        <w:tc>
+          <w:tcPr>
+            <w:shd w:fill="003366" w:val="clear"/>
+            <w:tcMar>
+              <w:top w:type="dxa" w:w="100"/>
+              <w:left w:type="dxa" w:w="150"/>
+              <w:bottom w:type="dxa" w:w="100"/>
+              <w:right w:type="dxa" w:w="150"/>
+            </w:tcMar>
+          </w:tcPr>
+          <w:p>
+            <w:pPr>
+              <w:jc w:val="center"/>
+            </w:pPr>
+            <w:r>
+              <w:rPr>
+                <w:rFonts w:ascii="Times New Roman" w:cs="Times New Roman" w:eastAsia="Times New Roman" w:hAnsi="Times New Roman"/>
+                <w:b/>
+                <w:bCs/>
+                <w:color w:val="FFFFFF"/>
+                <w:sz w:val="22"/>
+                <w:szCs w:val="22"/>
+              </w:rPr>
+              <w:t xml:space="preserve">File</w:t>
+            </w:r>
+          </w:p>
+        </w:tc>
+        <w:tc>
+          <w:tcPr>
+            <w:shd w:fill="003366" w:val="clear"/>
+            <w:tcMar>
+              <w:top w:type="dxa" w:w="100"/>
+              <w:left w:type="dxa" w:w="150"/>
+              <w:bottom w:type="dxa" w:w="100"/>
+              <w:right w:type="dxa" w:w="150"/>
+            </w:tcMar>
+          </w:tcPr>
+          <w:p>
+            <w:pPr>
+              <w:jc w:val="center"/>
+            </w:pPr>
+            <w:r>
+              <w:rPr>
+                <w:rFonts w:ascii="Times New Roman" w:cs="Times New Roman" w:eastAsia="Times New Roman" w:hAnsi="Times New Roman"/>
+                <w:b/>
+                <w:bCs/>
+                <w:color w:val="FFFFFF"/>
+                <w:sz w:val="22"/>
+                <w:szCs w:val="22"/>
+              </w:rPr>
+              <w:t xml:space="preserve">Vấn đề phát hiện</w:t>
+            </w:r>
+          </w:p>
+        </w:tc>
+        <w:tc>
+          <w:tcPr>
+            <w:shd w:fill="003366" w:val="clear"/>
+            <w:tcMar>
+              <w:top w:type="dxa" w:w="100"/>
+              <w:left w:type="dxa" w:w="150"/>
+              <w:bottom w:type="dxa" w:w="100"/>
+              <w:right w:type="dxa" w:w="150"/>
+            </w:tcMar>
+          </w:tcPr>
+          <w:p>
+            <w:pPr>
+              <w:jc w:val="center"/>
+            </w:pPr>
+            <w:r>
+              <w:rPr>
+                <w:rFonts w:ascii="Times New Roman" w:cs="Times New Roman" w:eastAsia="Times New Roman" w:hAnsi="Times New Roman"/>
+                <w:b/>
+                <w:bCs/>
+                <w:color w:val="FFFFFF"/>
+                <w:sz w:val="22"/>
+                <w:szCs w:val="22"/>
+              </w:rPr>
+              <w:t xml:space="preserve">Trạng thái</w:t>
+            </w:r>
+          </w:p>
+        </w:tc>
+      </w:tr>
+      <w:tr>
+        <w:tc>
+          <w:tcPr>
+            <w:shd w:fill="F2F5F8" w:val="clear"/>
+            <w:tcMar>
+              <w:top w:type="dxa" w:w="80"/>
+              <w:left w:type="dxa" w:w="120"/>
+              <w:bottom w:type="dxa" w:w="80"/>
+              <w:right w:type="dxa" w:w="120"/>
+            </w:tcMar>
+          </w:tcPr>
+          <w:p>
+            <w:r>
+              <w:rPr>
+                <w:rFonts w:ascii="Times New Roman" w:cs="Times New Roman" w:eastAsia="Times New Roman" w:hAnsi="Times New Roman"/>
+                <w:sz w:val="22"/>
+                <w:szCs w:val="22"/>
+              </w:rPr>
+              <w:t xml:space="preserve">db.js, schema.sql</w:t>
+            </w:r>
+          </w:p>
+        </w:tc>
+        <w:tc>
+          <w:tcPr>
+            <w:shd w:fill="F2F5F8" w:val="clear"/>
+            <w:tcMar>
+              <w:top w:type="dxa" w:w="80"/>
+              <w:left w:type="dxa" w:w="120"/>
+              <w:bottom w:type="dxa" w:w="80"/>
+              <w:right w:type="dxa" w:w="120"/>
+            </w:tcMar>
+          </w:tcPr>
+          <w:p>
+            <w:r>
+              <w:rPr>
+                <w:rFonts w:ascii="Times New Roman" w:cs="Times New Roman" w:eastAsia="Times New Roman" w:hAnsi="Times New Roman"/>
+                <w:sz w:val="22"/>
+                <w:szCs w:val="22"/>
+              </w:rPr>
+              <w:t xml:space="preserve">cargoDeclaration (khai báo hàng hóa IATA) chỉ lưu LocalStorage, không persist SQLite</w:t>
+            </w:r>
+          </w:p>
+        </w:tc>
+        <w:tc>
+          <w:tcPr>
+            <w:shd w:fill="F2F5F8" w:val="clear"/>
+            <w:tcMar>
+              <w:top w:type="dxa" w:w="80"/>
+              <w:left w:type="dxa" w:w="120"/>
+              <w:bottom w:type="dxa" w:w="80"/>
+              <w:right w:type="dxa" w:w="120"/>
+            </w:tcMar>
+          </w:tcPr>
+          <w:p>
+            <w:r>
+              <w:rPr>
+                <w:rFonts w:ascii="Times New Roman" w:cs="Times New Roman" w:eastAsia="Times New Roman" w:hAnsi="Times New Roman"/>
+                <w:sz w:val="22"/>
+                <w:szCs w:val="22"/>
+              </w:rPr>
+              <w:t xml:space="preserve">Đã sửa: thêm cargo_declaration_json TEXT + migration</w:t>
+            </w:r>
+          </w:p>
+        </w:tc>
+      </w:tr>
+      <w:tr>
+        <w:tc>
+          <w:tcPr>
+            <w:shd w:fill="FFFFFF" w:val="clear"/>
+            <w:tcMar>
+              <w:top w:type="dxa" w:w="80"/>
+              <w:left w:type="dxa" w:w="120"/>
+              <w:bottom w:type="dxa" w:w="80"/>
+              <w:right w:type="dxa" w:w="120"/>
+            </w:tcMar>
+          </w:tcPr>
+          <w:p>
+            <w:r>
+              <w:rPr>
+                <w:rFonts w:ascii="Times New Roman" w:cs="Times New Roman" w:eastAsia="Times New Roman" w:hAnsi="Times New Roman"/>
+                <w:sz w:val="22"/>
+                <w:szCs w:val="22"/>
+              </w:rPr>
+              <w:t xml:space="preserve">server.js</w:t>
+            </w:r>
+          </w:p>
+        </w:tc>
+        <w:tc>
+          <w:tcPr>
+            <w:shd w:fill="FFFFFF" w:val="clear"/>
+            <w:tcMar>
+              <w:top w:type="dxa" w:w="80"/>
+              <w:left w:type="dxa" w:w="120"/>
+              <w:bottom w:type="dxa" w:w="80"/>
+              <w:right w:type="dxa" w:w="120"/>
+            </w:tcMar>
+          </w:tcPr>
+          <w:p>
+            <w:r>
+              <w:rPr>
+                <w:rFonts w:ascii="Times New Roman" w:cs="Times New Roman" w:eastAsia="Times New Roman" w:hAnsi="Times New Roman"/>
+                <w:sz w:val="22"/>
+                <w:szCs w:val="22"/>
+              </w:rPr>
+              <w:t xml:space="preserve">Agent status không nhất quán: HTML so sánh 'LOCKED', server ghi 'Đã khóa'</w:t>
+            </w:r>
+          </w:p>
+        </w:tc>
+        <w:tc>
+          <w:tcPr>
+            <w:shd w:fill="FFFFFF" w:val="clear"/>
+            <w:tcMar>
+              <w:top w:type="dxa" w:w="80"/>
+              <w:left w:type="dxa" w:w="120"/>
+              <w:bottom w:type="dxa" w:w="80"/>
+              <w:right w:type="dxa" w:w="120"/>
+            </w:tcMar>
+          </w:tcPr>
+          <w:p>
+            <w:r>
+              <w:rPr>
+                <w:rFonts w:ascii="Times New Roman" w:cs="Times New Roman" w:eastAsia="Times New Roman" w:hAnsi="Times New Roman"/>
+                <w:sz w:val="22"/>
+                <w:szCs w:val="22"/>
+              </w:rPr>
+              <w:t xml:space="preserve">Đã sửa: chuẩn hóa sang 'LOCKED'</w:t>
+            </w:r>
+          </w:p>
+        </w:tc>
+      </w:tr>
+      <w:tr>
+        <w:tc>
+          <w:tcPr>
+            <w:shd w:fill="F2F5F8" w:val="clear"/>
+            <w:tcMar>
+              <w:top w:type="dxa" w:w="80"/>
+              <w:left w:type="dxa" w:w="120"/>
+              <w:bottom w:type="dxa" w:w="80"/>
+              <w:right w:type="dxa" w:w="120"/>
+            </w:tcMar>
+          </w:tcPr>
+          <w:p>
+            <w:r>
+              <w:rPr>
+                <w:rFonts w:ascii="Times New Roman" w:cs="Times New Roman" w:eastAsia="Times New Roman" w:hAnsi="Times New Roman"/>
+                <w:sz w:val="22"/>
+                <w:szCs w:val="22"/>
+              </w:rPr>
+              <w:t xml:space="preserve">schema.sql</w:t>
+            </w:r>
+          </w:p>
+        </w:tc>
+        <w:tc>
+          <w:tcPr>
+            <w:shd w:fill="F2F5F8" w:val="clear"/>
+            <w:tcMar>
+              <w:top w:type="dxa" w:w="80"/>
+              <w:left w:type="dxa" w:w="120"/>
+              <w:bottom w:type="dxa" w:w="80"/>
+              <w:right w:type="dxa" w:w="120"/>
+            </w:tcMar>
+          </w:tcPr>
+          <w:p>
+            <w:r>
+              <w:rPr>
+                <w:rFonts w:ascii="Times New Roman" w:cs="Times New Roman" w:eastAsia="Times New Roman" w:hAnsi="Times New Roman"/>
+                <w:sz w:val="22"/>
+                <w:szCs w:val="22"/>
+              </w:rPr>
+              <w:t xml:space="preserve">Bảng activity_logs có trong db.js nhưng thiếu trong schema.sql</w:t>
+            </w:r>
+          </w:p>
+        </w:tc>
+        <w:tc>
+          <w:tcPr>
+            <w:shd w:fill="F2F5F8" w:val="clear"/>
+            <w:tcMar>
+              <w:top w:type="dxa" w:w="80"/>
+              <w:left w:type="dxa" w:w="120"/>
+              <w:bottom w:type="dxa" w:w="80"/>
+              <w:right w:type="dxa" w:w="120"/>
+            </w:tcMar>
+          </w:tcPr>
+          <w:p>
+            <w:r>
+              <w:rPr>
+                <w:rFonts w:ascii="Times New Roman" w:cs="Times New Roman" w:eastAsia="Times New Roman" w:hAnsi="Times New Roman"/>
+                <w:sz w:val="22"/>
+                <w:szCs w:val="22"/>
+              </w:rPr>
+              <w:t xml:space="preserve">Đã sửa: thêm DDL đầy đủ</w:t>
+            </w:r>
+          </w:p>
+        </w:tc>
+      </w:tr>
+      <w:tr>
+        <w:tc>
+          <w:tcPr>
+            <w:shd w:fill="FFFFFF" w:val="clear"/>
+            <w:tcMar>
+              <w:top w:type="dxa" w:w="80"/>
+              <w:left w:type="dxa" w:w="120"/>
+              <w:bottom w:type="dxa" w:w="80"/>
+              <w:right w:type="dxa" w:w="120"/>
+            </w:tcMar>
+          </w:tcPr>
+          <w:p>
+            <w:r>
+              <w:rPr>
+                <w:rFonts w:ascii="Times New Roman" w:cs="Times New Roman" w:eastAsia="Times New Roman" w:hAnsi="Times New Roman"/>
+                <w:sz w:val="22"/>
+                <w:szCs w:val="22"/>
+              </w:rPr>
+              <w:t xml:space="preserve">db.js</w:t>
+            </w:r>
+          </w:p>
+        </w:tc>
+        <w:tc>
+          <w:tcPr>
+            <w:shd w:fill="FFFFFF" w:val="clear"/>
+            <w:tcMar>
+              <w:top w:type="dxa" w:w="80"/>
+              <w:left w:type="dxa" w:w="120"/>
+              <w:bottom w:type="dxa" w:w="80"/>
+              <w:right w:type="dxa" w:w="120"/>
+            </w:tcMar>
+          </w:tcPr>
+          <w:p>
+            <w:r>
+              <w:rPr>
+                <w:rFonts w:ascii="Times New Roman" w:cs="Times New Roman" w:eastAsia="Times New Roman" w:hAnsi="Times New Roman"/>
+                <w:sz w:val="22"/>
+                <w:szCs w:val="22"/>
+              </w:rPr>
+              <w:t xml:space="preserve">staff02/staff2026 ghi trong tài liệu nhưng không seed vào DB</w:t>
+            </w:r>
+          </w:p>
+        </w:tc>
+        <w:tc>
+          <w:tcPr>
+            <w:shd w:fill="FFFFFF" w:val="clear"/>
+            <w:tcMar>
+              <w:top w:type="dxa" w:w="80"/>
+              <w:left w:type="dxa" w:w="120"/>
+              <w:bottom w:type="dxa" w:w="80"/>
+              <w:right w:type="dxa" w:w="120"/>
+            </w:tcMar>
+          </w:tcPr>
+          <w:p>
+            <w:r>
+              <w:rPr>
+                <w:rFonts w:ascii="Times New Roman" w:cs="Times New Roman" w:eastAsia="Times New Roman" w:hAnsi="Times New Roman"/>
+                <w:sz w:val="22"/>
+                <w:szCs w:val="22"/>
+              </w:rPr>
+              <w:t xml:space="preserve">Đã sửa: thêm USR-008</w:t>
+            </w:r>
+          </w:p>
+        </w:tc>
+      </w:tr>
+      <w:tr>
+        <w:tc>
+          <w:tcPr>
+            <w:shd w:fill="F2F5F8" w:val="clear"/>
+            <w:tcMar>
+              <w:top w:type="dxa" w:w="80"/>
+              <w:left w:type="dxa" w:w="120"/>
+              <w:bottom w:type="dxa" w:w="80"/>
+              <w:right w:type="dxa" w:w="120"/>
+            </w:tcMar>
+          </w:tcPr>
+          <w:p>
+            <w:r>
+              <w:rPr>
+                <w:rFonts w:ascii="Times New Roman" w:cs="Times New Roman" w:eastAsia="Times New Roman" w:hAnsi="Times New Roman"/>
+                <w:sz w:val="22"/>
+                <w:szCs w:val="22"/>
+              </w:rPr>
+              <w:t xml:space="preserve">cargo-store.js</w:t>
+            </w:r>
+          </w:p>
+        </w:tc>
+        <w:tc>
+          <w:tcPr>
+            <w:shd w:fill="F2F5F8" w:val="clear"/>
+            <w:tcMar>
+              <w:top w:type="dxa" w:w="80"/>
+              <w:left w:type="dxa" w:w="120"/>
+              <w:bottom w:type="dxa" w:w="80"/>
+              <w:right w:type="dxa" w:w="120"/>
+            </w:tcMar>
+          </w:tcPr>
+          <w:p>
+            <w:r>
+              <w:rPr>
+                <w:rFonts w:ascii="Times New Roman" w:cs="Times New Roman" w:eastAsia="Times New Roman" w:hAnsi="Times New Roman"/>
+                <w:sz w:val="22"/>
+                <w:szCs w:val="22"/>
+              </w:rPr>
+              <w:t xml:space="preserve">Hardcoded localhost:8085/api/data trong saveData() và syncWithServer()</w:t>
+            </w:r>
+          </w:p>
+        </w:tc>
+        <w:tc>
+          <w:tcPr>
+            <w:shd w:fill="F2F5F8" w:val="clear"/>
+            <w:tcMar>
+              <w:top w:type="dxa" w:w="80"/>
+              <w:left w:type="dxa" w:w="120"/>
+              <w:bottom w:type="dxa" w:w="80"/>
+              <w:right w:type="dxa" w:w="120"/>
+            </w:tcMar>
+          </w:tcPr>
+          <w:p>
+            <w:r>
+              <w:rPr>
+                <w:rFonts w:ascii="Times New Roman" w:cs="Times New Roman" w:eastAsia="Times New Roman" w:hAnsi="Times New Roman"/>
+                <w:sz w:val="22"/>
+                <w:szCs w:val="22"/>
+              </w:rPr>
+              <w:t xml:space="preserve">Đã sửa: dùng relative /api/data</w:t>
+            </w:r>
+          </w:p>
+        </w:tc>
+      </w:tr>
+      <w:tr>
+        <w:tc>
+          <w:tcPr>
+            <w:shd w:fill="FFFFFF" w:val="clear"/>
+            <w:tcMar>
+              <w:top w:type="dxa" w:w="80"/>
+              <w:left w:type="dxa" w:w="120"/>
+              <w:bottom w:type="dxa" w:w="80"/>
+              <w:right w:type="dxa" w:w="120"/>
+            </w:tcMar>
+          </w:tcPr>
+          <w:p>
+            <w:r>
+              <w:rPr>
+                <w:rFonts w:ascii="Times New Roman" w:cs="Times New Roman" w:eastAsia="Times New Roman" w:hAnsi="Times New Roman"/>
+                <w:sz w:val="22"/>
+                <w:szCs w:val="22"/>
+              </w:rPr>
+              <w:t xml:space="preserve">Admin/10-AuditLogs.html</w:t>
+            </w:r>
+          </w:p>
+        </w:tc>
+        <w:tc>
+          <w:tcPr>
+            <w:shd w:fill="FFFFFF" w:val="clear"/>
+            <w:tcMar>
+              <w:top w:type="dxa" w:w="80"/>
+              <w:left w:type="dxa" w:w="120"/>
+              <w:bottom w:type="dxa" w:w="80"/>
+              <w:right w:type="dxa" w:w="120"/>
+            </w:tcMar>
+          </w:tcPr>
+          <w:p>
+            <w:r>
+              <w:rPr>
+                <w:rFonts w:ascii="Times New Roman" w:cs="Times New Roman" w:eastAsia="Times New Roman" w:hAnsi="Times New Roman"/>
+                <w:sz w:val="22"/>
+                <w:szCs w:val="22"/>
+              </w:rPr>
+              <w:t xml:space="preserve">Nav links sai: 01-Dashboard.html, 02-AuctionManagement.html không tồn tại</w:t>
+            </w:r>
+          </w:p>
+        </w:tc>
+        <w:tc>
+          <w:tcPr>
+            <w:shd w:fill="FFFFFF" w:val="clear"/>
+            <w:tcMar>
+              <w:top w:type="dxa" w:w="80"/>
+              <w:left w:type="dxa" w:w="120"/>
+              <w:bottom w:type="dxa" w:w="80"/>
+              <w:right w:type="dxa" w:w="120"/>
+            </w:tcMar>
+          </w:tcPr>
+          <w:p>
+            <w:r>
+              <w:rPr>
+                <w:rFonts w:ascii="Times New Roman" w:cs="Times New Roman" w:eastAsia="Times New Roman" w:hAnsi="Times New Roman"/>
+                <w:sz w:val="22"/>
+                <w:szCs w:val="22"/>
+              </w:rPr>
+              <w:t xml:space="preserve">Đã sửa: đổi sang đúng tên file</w:t>
+            </w:r>
+          </w:p>
+        </w:tc>
+      </w:tr>
+      <w:tr>
+        <w:tc>
+          <w:tcPr>
+            <w:shd w:fill="F2F5F8" w:val="clear"/>
+            <w:tcMar>
+              <w:top w:type="dxa" w:w="80"/>
+              <w:left w:type="dxa" w:w="120"/>
+              <w:bottom w:type="dxa" w:w="80"/>
+              <w:right w:type="dxa" w:w="120"/>
+            </w:tcMar>
+          </w:tcPr>
+          <w:p>
+            <w:r>
+              <w:rPr>
+                <w:rFonts w:ascii="Times New Roman" w:cs="Times New Roman" w:eastAsia="Times New Roman" w:hAnsi="Times New Roman"/>
+                <w:sz w:val="22"/>
+                <w:szCs w:val="22"/>
+              </w:rPr>
+              <w:t xml:space="preserve">Admin/*.html (9 trang)</w:t>
+            </w:r>
+          </w:p>
+        </w:tc>
+        <w:tc>
+          <w:tcPr>
+            <w:shd w:fill="F2F5F8" w:val="clear"/>
+            <w:tcMar>
+              <w:top w:type="dxa" w:w="80"/>
+              <w:left w:type="dxa" w:w="120"/>
+              <w:bottom w:type="dxa" w:w="80"/>
+              <w:right w:type="dxa" w:w="120"/>
+            </w:tcMar>
+          </w:tcPr>
+          <w:p>
+            <w:r>
+              <w:rPr>
+                <w:rFonts w:ascii="Times New Roman" w:cs="Times New Roman" w:eastAsia="Times New Roman" w:hAnsi="Times New Roman"/>
+                <w:sz w:val="22"/>
+                <w:szCs w:val="22"/>
+              </w:rPr>
+              <w:t xml:space="preserve">Header trắng đơn giản, thiếu nhất quán thiết kế</w:t>
+            </w:r>
+          </w:p>
+        </w:tc>
+        <w:tc>
+          <w:tcPr>
+            <w:shd w:fill="F2F5F8" w:val="clear"/>
+            <w:tcMar>
+              <w:top w:type="dxa" w:w="80"/>
+              <w:left w:type="dxa" w:w="120"/>
+              <w:bottom w:type="dxa" w:w="80"/>
+              <w:right w:type="dxa" w:w="120"/>
+            </w:tcMar>
+          </w:tcPr>
+          <w:p>
+            <w:r>
+              <w:rPr>
+                <w:rFonts w:ascii="Times New Roman" w:cs="Times New Roman" w:eastAsia="Times New Roman" w:hAnsi="Times New Roman"/>
+                <w:sz w:val="22"/>
+                <w:szCs w:val="22"/>
+              </w:rPr>
+              <w:t xml:space="preserve">Đã redesign: Premium dark header đồng bộ toàn portal</w:t>
+            </w:r>
+          </w:p>
+        </w:tc>
+      </w:tr>
+    </w:tbl>
+    <w:p>
+      <w:pPr>
+        <w:spacing w:after="60" w:before="60" w:line="276"/>
+        <w:jc w:val="left"/>
+      </w:pPr>
+      <w:r>
+        <w:rPr>
+          <w:rFonts w:ascii="Times New Roman" w:cs="Times New Roman" w:eastAsia="Times New Roman" w:hAnsi="Times New Roman"/>
+          <w:b w:val="false"/>
+          <w:bCs w:val="false"/>
+          <w:color w:val="000000"/>
+          <w:sz w:val="24"/>
+          <w:szCs w:val="24"/>
+        </w:rPr>
+        <w:t xml:space="preserve">Admin Portal Premium Dark Header — 9 trang đồng bộ: Dark navy gradient (#0f172a → #1e293b), accent line gradient xanh-tím, Blue glow pill cho active nav, Purple accent riêng cho Chat, mobile hamburger dropdown.</w:t>
+      </w:r>
+    </w:p>
+    <w:p>
+      <w:pPr>
+        <w:pStyle w:val="Heading1"/>
+        <w:spacing w:after="120" w:before="280"/>
+      </w:pPr>
+      <w:r>
+        <w:rPr>
+          <w:rFonts w:ascii="Times New Roman" w:cs="Times New Roman" w:eastAsia="Times New Roman" w:hAnsi="Times New Roman"/>
+          <w:b/>
+          <w:bCs/>
+          <w:color w:val="003366"/>
+          <w:sz w:val="28"/>
+          <w:szCs w:val="28"/>
+        </w:rPr>
+        <w:t xml:space="preserve">&amp; KIỂM THỬ TỰ ĐỘNG CẬP NHẬT — 12/12 Test Cases PASS (v1.2)</w:t>
+      </w:r>
+    </w:p>
+    <w:p>
+      <w:pPr>
+        <w:spacing w:after="60" w:before="60" w:line="276"/>
+        <w:jc w:val="left"/>
+      </w:pPr>
+      <w:r>
+        <w:rPr>
+          <w:rFonts w:ascii="Times New Roman" w:cs="Times New Roman" w:eastAsia="Times New Roman" w:hAnsi="Times New Roman"/>
+          <w:b w:val="false"/>
+          <w:bCs w:val="false"/>
+          <w:color w:val="000000"/>
+          <w:sz w:val="24"/>
+          <w:szCs w:val="24"/>
+        </w:rPr>
+        <w:t xml:space="preserve">Bộ test Jest &amp; Supertest vẫn duy trì 12/12 PASS sau toàn bộ các thay đổi v1.2 — không có regression.</w:t>
+      </w:r>
+    </w:p>
+    <w:p>
+      <w:pPr>
+        <w:pStyle w:val="Heading1"/>
+        <w:spacing w:after="120" w:before="280"/>
+      </w:pPr>
+      <w:r>
+        <w:rPr>
+          <w:rFonts w:ascii="Times New Roman" w:cs="Times New Roman" w:eastAsia="Times New Roman" w:hAnsi="Times New Roman"/>
+          <w:b/>
+          <w:bCs/>
+          <w:color w:val="003366"/>
+          <w:sz w:val="28"/>
+          <w:szCs w:val="28"/>
+        </w:rPr>
+        <w:t xml:space="preserve">10. KẾT LUẬN &amp; HƯỚNG DẪN VẬN HÀNH</w:t>
+      </w:r>
+    </w:p>
+    <w:p>
+      <w:pPr>
+        <w:spacing w:after="60" w:before="60" w:line="276"/>
+        <w:jc w:val="left"/>
+      </w:pPr>
+      <w:r>
+        <w:rPr>
+          <w:rFonts w:ascii="Times New Roman" w:cs="Times New Roman" w:eastAsia="Times New Roman" w:hAnsi="Times New Roman"/>
+          <w:b w:val="false"/>
+          <w:bCs w:val="false"/>
+          <w:color w:val="000000"/>
+          <w:sz w:val="24"/>
+          <w:szCs w:val="24"/>
+        </w:rPr>
+        <w:t xml:space="preserve">Giải pháp Sàn Đấu Giá Tải Trọng Hàng Không Vietravel Airlines (VU Air Cargo Bidding) v1.2 đã đáp ứng hoàn hảo các yêu cầu về nghiệp vụ vận tải hàng không hiện đại, mang lại quy trình minh bạch, tốc độ và tối ưu doanh thu khai thác tối đa cho Hãng.</w:t>
       </w:r>
     </w:p>
     <w:p>

</xml_diff>